<commit_message>
Update repository root to MathGov Core v12.6 / SGP v8.5
Synchronize the authoritative repository root with the final MathGov Core v12.6 / SGP v8.5 publication baseline.

Build: 2026.08.15.3

Updates the current Core 15, documentation, schemas, tests, release metadata, verification surfaces, and publication files to match the frozen v12.6 release package.

Canonical cascade:
RG -> RF/NCRC -> TRC -> CSV -> RLS

Supersedes the v12.5 root release index while preserving historical v12.5 release artifacts under releases/.
</commit_message>
<xml_diff>
--- a/docs/CORE_COMPONENT_MAP.docx
+++ b/docs/CORE_COMPONENT_MAP.docx
@@ -8,7 +8,7 @@
         <w:pStyle w:val="Heading1"/>
       </w:pPr>
       <w:r>
-        <w:t xml:space="preserve">MathGov Core Component Map - v12.5 / SGP v8.4</w:t>
+        <w:t>MathGov Core Component Map - v12.6 / SGP v8.5</w:t>
       </w:r>
     </w:p>
     <w:tbl>
@@ -18,6 +18,14 @@
         <w:jc w:val="left"/>
         <w:tblLook w:firstRow="1" w:lastRow="0" w:firstColumn="0" w:lastColumn="0" w:noHBand="0" w:noVBand="0" w:val="0020"/>
         <w:tblInd w:type="dxa" w:w="0"/>
+        <w:tblBorders>
+          <w:top w:val="single" w:sz="8" w:color="AFC4D6"/>
+          <w:left w:val="single" w:sz="8" w:color="AFC4D6"/>
+          <w:bottom w:val="single" w:sz="8" w:color="AFC4D6"/>
+          <w:right w:val="single" w:sz="8" w:color="AFC4D6"/>
+          <w:insideH w:val="single" w:sz="4" w:color="AFC4D6"/>
+          <w:insideV w:val="single" w:sz="4" w:color="AFC4D6"/>
+        </w:tblBorders>
       </w:tblPr>
       <w:tblGrid>
         <w:gridCol w:w="1980"/>
@@ -28,16 +36,18 @@
       <w:tr>
         <w:trPr>
           <w:tblHeader w:val="on"/>
+          <w:tblHeader w:val="true"/>
         </w:trPr>
         <w:tc>
           <w:tcPr>
-            <w:shd w:fill="1F4E78" w:val="clear"/>
-            <w:tcMar>
-              <w:top w:w="80" w:type="dxa"/>
-              <w:start w:w="90" w:type="dxa"/>
-              <w:bottom w:w="80" w:type="dxa"/>
-              <w:end w:w="90" w:type="dxa"/>
-            </w:tcMar>
+            <w:tcMar>
+              <w:top w:w="80" w:type="dxa"/>
+              <w:start w:w="90" w:type="dxa"/>
+              <w:bottom w:w="80" w:type="dxa"/>
+              <w:end w:w="90" w:type="dxa"/>
+            </w:tcMar>
+            <w:shd w:val="clear" w:fill="D9EAF7"/>
+            <w:vAlign w:val="center"/>
           </w:tcPr>
           <w:p>
             <w:pPr>
@@ -47,7 +57,7 @@
             <w:r>
               <w:rPr>
                 <w:b/>
-                <w:color w:val="FFFFFF"/>
+                <w:color w:val="17365D"/>
               </w:rPr>
               <w:t xml:space="preserve">Component</w:t>
             </w:r>
@@ -55,13 +65,14 @@
         </w:tc>
         <w:tc>
           <w:tcPr>
-            <w:shd w:fill="1F4E78" w:val="clear"/>
-            <w:tcMar>
-              <w:top w:w="80" w:type="dxa"/>
-              <w:start w:w="90" w:type="dxa"/>
-              <w:bottom w:w="80" w:type="dxa"/>
-              <w:end w:w="90" w:type="dxa"/>
-            </w:tcMar>
+            <w:tcMar>
+              <w:top w:w="80" w:type="dxa"/>
+              <w:start w:w="90" w:type="dxa"/>
+              <w:bottom w:w="80" w:type="dxa"/>
+              <w:end w:w="90" w:type="dxa"/>
+            </w:tcMar>
+            <w:shd w:val="clear" w:fill="D9EAF7"/>
+            <w:vAlign w:val="center"/>
           </w:tcPr>
           <w:p>
             <w:pPr>
@@ -71,7 +82,7 @@
             <w:r>
               <w:rPr>
                 <w:b/>
-                <w:color w:val="FFFFFF"/>
+                <w:color w:val="17365D"/>
               </w:rPr>
               <w:t xml:space="preserve">Version</w:t>
             </w:r>
@@ -79,13 +90,14 @@
         </w:tc>
         <w:tc>
           <w:tcPr>
-            <w:shd w:fill="1F4E78" w:val="clear"/>
-            <w:tcMar>
-              <w:top w:w="80" w:type="dxa"/>
-              <w:start w:w="90" w:type="dxa"/>
-              <w:bottom w:w="80" w:type="dxa"/>
-              <w:end w:w="90" w:type="dxa"/>
-            </w:tcMar>
+            <w:tcMar>
+              <w:top w:w="80" w:type="dxa"/>
+              <w:start w:w="90" w:type="dxa"/>
+              <w:bottom w:w="80" w:type="dxa"/>
+              <w:end w:w="90" w:type="dxa"/>
+            </w:tcMar>
+            <w:shd w:val="clear" w:fill="D9EAF7"/>
+            <w:vAlign w:val="center"/>
           </w:tcPr>
           <w:p>
             <w:pPr>
@@ -95,7 +107,7 @@
             <w:r>
               <w:rPr>
                 <w:b/>
-                <w:color w:val="FFFFFF"/>
+                <w:color w:val="17365D"/>
               </w:rPr>
               <w:t xml:space="preserve">Role</w:t>
             </w:r>
@@ -103,13 +115,14 @@
         </w:tc>
         <w:tc>
           <w:tcPr>
-            <w:shd w:fill="1F4E78" w:val="clear"/>
-            <w:tcMar>
-              <w:top w:w="80" w:type="dxa"/>
-              <w:start w:w="90" w:type="dxa"/>
-              <w:bottom w:w="80" w:type="dxa"/>
-              <w:end w:w="90" w:type="dxa"/>
-            </w:tcMar>
+            <w:tcMar>
+              <w:top w:w="80" w:type="dxa"/>
+              <w:start w:w="90" w:type="dxa"/>
+              <w:bottom w:w="80" w:type="dxa"/>
+              <w:end w:w="90" w:type="dxa"/>
+            </w:tcMar>
+            <w:shd w:val="clear" w:fill="D9EAF7"/>
+            <w:vAlign w:val="center"/>
           </w:tcPr>
           <w:p>
             <w:pPr>
@@ -119,7 +132,7 @@
             <w:r>
               <w:rPr>
                 <w:b/>
-                <w:color w:val="FFFFFF"/>
+                <w:color w:val="17365D"/>
               </w:rPr>
               <w:t xml:space="preserve">Boundary</w:t>
             </w:r>
@@ -137,6 +150,7 @@
               <w:end w:w="90" w:type="dxa"/>
             </w:tcMar>
             <w:shd w:fill="F7FBFF" w:val="clear"/>
+            <w:vAlign w:val="top"/>
           </w:tcPr>
           <w:p>
             <w:pPr>
@@ -157,26 +171,24 @@
               <w:end w:w="90" w:type="dxa"/>
             </w:tcMar>
             <w:shd w:fill="F7FBFF" w:val="clear"/>
-          </w:tcPr>
-          <w:p>
-            <w:pPr>
-              <w:pStyle w:val="Compact"/>
-              <w:jc w:val="right"/>
-            </w:pPr>
-            <w:r>
-              <w:t xml:space="preserve">v12.5</w:t>
-            </w:r>
-          </w:p>
-        </w:tc>
-        <w:tc>
-          <w:tcPr>
-            <w:tcMar>
-              <w:top w:w="80" w:type="dxa"/>
-              <w:start w:w="90" w:type="dxa"/>
-              <w:bottom w:w="80" w:type="dxa"/>
-              <w:end w:w="90" w:type="dxa"/>
-            </w:tcMar>
-            <w:shd w:fill="F7FBFF" w:val="clear"/>
+            <w:vAlign w:val="top"/>
+          </w:tcPr>
+          <w:p>
+            <w:r>
+              <w:t>v12.6</w:t>
+            </w:r>
+          </w:p>
+        </w:tc>
+        <w:tc>
+          <w:tcPr>
+            <w:tcMar>
+              <w:top w:w="80" w:type="dxa"/>
+              <w:start w:w="90" w:type="dxa"/>
+              <w:bottom w:w="80" w:type="dxa"/>
+              <w:end w:w="90" w:type="dxa"/>
+            </w:tcMar>
+            <w:shd w:fill="F7FBFF" w:val="clear"/>
+            <w:vAlign w:val="top"/>
           </w:tcPr>
           <w:p>
             <w:pPr>
@@ -197,6 +209,7 @@
               <w:end w:w="90" w:type="dxa"/>
             </w:tcMar>
             <w:shd w:fill="F7FBFF" w:val="clear"/>
+            <w:vAlign w:val="top"/>
           </w:tcPr>
           <w:p>
             <w:pPr>
@@ -219,7 +232,8 @@
               <w:bottom w:w="80" w:type="dxa"/>
               <w:end w:w="90" w:type="dxa"/>
             </w:tcMar>
-            <w:shd w:fill="D9EAF7" w:val="clear"/>
+            <w:shd w:val="clear" w:fill="F7FBFE"/>
+            <w:vAlign w:val="top"/>
           </w:tcPr>
           <w:p>
             <w:pPr>
@@ -239,27 +253,25 @@
               <w:bottom w:w="80" w:type="dxa"/>
               <w:end w:w="90" w:type="dxa"/>
             </w:tcMar>
-            <w:shd w:fill="D9EAF7" w:val="clear"/>
-          </w:tcPr>
-          <w:p>
-            <w:pPr>
-              <w:pStyle w:val="Compact"/>
-              <w:jc w:val="right"/>
-            </w:pPr>
-            <w:r>
-              <w:t xml:space="preserve">v8.4</w:t>
-            </w:r>
-          </w:p>
-        </w:tc>
-        <w:tc>
-          <w:tcPr>
-            <w:tcMar>
-              <w:top w:w="80" w:type="dxa"/>
-              <w:start w:w="90" w:type="dxa"/>
-              <w:bottom w:w="80" w:type="dxa"/>
-              <w:end w:w="90" w:type="dxa"/>
-            </w:tcMar>
-            <w:shd w:fill="D9EAF7" w:val="clear"/>
+            <w:shd w:val="clear" w:fill="F7FBFE"/>
+            <w:vAlign w:val="top"/>
+          </w:tcPr>
+          <w:p>
+            <w:r>
+              <w:t>v8.5</w:t>
+            </w:r>
+          </w:p>
+        </w:tc>
+        <w:tc>
+          <w:tcPr>
+            <w:tcMar>
+              <w:top w:w="80" w:type="dxa"/>
+              <w:start w:w="90" w:type="dxa"/>
+              <w:bottom w:w="80" w:type="dxa"/>
+              <w:end w:w="90" w:type="dxa"/>
+            </w:tcMar>
+            <w:shd w:val="clear" w:fill="F7FBFE"/>
+            <w:vAlign w:val="top"/>
           </w:tcPr>
           <w:p>
             <w:pPr>
@@ -279,7 +291,8 @@
               <w:bottom w:w="80" w:type="dxa"/>
               <w:end w:w="90" w:type="dxa"/>
             </w:tcMar>
-            <w:shd w:fill="D9EAF7" w:val="clear"/>
+            <w:shd w:val="clear" w:fill="F7FBFE"/>
+            <w:vAlign w:val="top"/>
           </w:tcPr>
           <w:p>
             <w:pPr>
@@ -303,6 +316,7 @@
               <w:end w:w="90" w:type="dxa"/>
             </w:tcMar>
             <w:shd w:fill="F7FBFF" w:val="clear"/>
+            <w:vAlign w:val="top"/>
           </w:tcPr>
           <w:p>
             <w:pPr>
@@ -323,26 +337,24 @@
               <w:end w:w="90" w:type="dxa"/>
             </w:tcMar>
             <w:shd w:fill="F7FBFF" w:val="clear"/>
-          </w:tcPr>
-          <w:p>
-            <w:pPr>
-              <w:pStyle w:val="Compact"/>
-              <w:jc w:val="right"/>
-            </w:pPr>
-            <w:r>
-              <w:t xml:space="preserve">v5.4</w:t>
-            </w:r>
-          </w:p>
-        </w:tc>
-        <w:tc>
-          <w:tcPr>
-            <w:tcMar>
-              <w:top w:w="80" w:type="dxa"/>
-              <w:start w:w="90" w:type="dxa"/>
-              <w:bottom w:w="80" w:type="dxa"/>
-              <w:end w:w="90" w:type="dxa"/>
-            </w:tcMar>
-            <w:shd w:fill="F7FBFF" w:val="clear"/>
+            <w:vAlign w:val="top"/>
+          </w:tcPr>
+          <w:p>
+            <w:r>
+              <w:t>v5.5</w:t>
+            </w:r>
+          </w:p>
+        </w:tc>
+        <w:tc>
+          <w:tcPr>
+            <w:tcMar>
+              <w:top w:w="80" w:type="dxa"/>
+              <w:start w:w="90" w:type="dxa"/>
+              <w:bottom w:w="80" w:type="dxa"/>
+              <w:end w:w="90" w:type="dxa"/>
+            </w:tcMar>
+            <w:shd w:fill="F7FBFF" w:val="clear"/>
+            <w:vAlign w:val="top"/>
           </w:tcPr>
           <w:p>
             <w:pPr>
@@ -363,6 +375,7 @@
               <w:end w:w="90" w:type="dxa"/>
             </w:tcMar>
             <w:shd w:fill="F7FBFF" w:val="clear"/>
+            <w:vAlign w:val="top"/>
           </w:tcPr>
           <w:p>
             <w:pPr>
@@ -385,7 +398,8 @@
               <w:bottom w:w="80" w:type="dxa"/>
               <w:end w:w="90" w:type="dxa"/>
             </w:tcMar>
-            <w:shd w:fill="D9EAF7" w:val="clear"/>
+            <w:shd w:val="clear" w:fill="F7FBFE"/>
+            <w:vAlign w:val="top"/>
           </w:tcPr>
           <w:p>
             <w:pPr>
@@ -405,27 +419,25 @@
               <w:bottom w:w="80" w:type="dxa"/>
               <w:end w:w="90" w:type="dxa"/>
             </w:tcMar>
-            <w:shd w:fill="D9EAF7" w:val="clear"/>
-          </w:tcPr>
-          <w:p>
-            <w:pPr>
-              <w:pStyle w:val="Compact"/>
-              <w:jc w:val="right"/>
-            </w:pPr>
-            <w:r>
-              <w:t xml:space="preserve">v12.3</w:t>
-            </w:r>
-          </w:p>
-        </w:tc>
-        <w:tc>
-          <w:tcPr>
-            <w:tcMar>
-              <w:top w:w="80" w:type="dxa"/>
-              <w:start w:w="90" w:type="dxa"/>
-              <w:bottom w:w="80" w:type="dxa"/>
-              <w:end w:w="90" w:type="dxa"/>
-            </w:tcMar>
-            <w:shd w:fill="D9EAF7" w:val="clear"/>
+            <w:shd w:val="clear" w:fill="F7FBFE"/>
+            <w:vAlign w:val="top"/>
+          </w:tcPr>
+          <w:p>
+            <w:r>
+              <w:t>v12.5</w:t>
+            </w:r>
+          </w:p>
+        </w:tc>
+        <w:tc>
+          <w:tcPr>
+            <w:tcMar>
+              <w:top w:w="80" w:type="dxa"/>
+              <w:start w:w="90" w:type="dxa"/>
+              <w:bottom w:w="80" w:type="dxa"/>
+              <w:end w:w="90" w:type="dxa"/>
+            </w:tcMar>
+            <w:shd w:val="clear" w:fill="F7FBFE"/>
+            <w:vAlign w:val="top"/>
           </w:tcPr>
           <w:p>
             <w:pPr>
@@ -445,7 +457,8 @@
               <w:bottom w:w="80" w:type="dxa"/>
               <w:end w:w="90" w:type="dxa"/>
             </w:tcMar>
-            <w:shd w:fill="D9EAF7" w:val="clear"/>
+            <w:shd w:val="clear" w:fill="F7FBFE"/>
+            <w:vAlign w:val="top"/>
           </w:tcPr>
           <w:p>
             <w:pPr>
@@ -469,6 +482,7 @@
               <w:end w:w="90" w:type="dxa"/>
             </w:tcMar>
             <w:shd w:fill="F7FBFF" w:val="clear"/>
+            <w:vAlign w:val="top"/>
           </w:tcPr>
           <w:p>
             <w:pPr>
@@ -489,26 +503,24 @@
               <w:end w:w="90" w:type="dxa"/>
             </w:tcMar>
             <w:shd w:fill="F7FBFF" w:val="clear"/>
-          </w:tcPr>
-          <w:p>
-            <w:pPr>
-              <w:pStyle w:val="Compact"/>
-              <w:jc w:val="right"/>
-            </w:pPr>
-            <w:r>
-              <w:t xml:space="preserve">v2.3</w:t>
-            </w:r>
-          </w:p>
-        </w:tc>
-        <w:tc>
-          <w:tcPr>
-            <w:tcMar>
-              <w:top w:w="80" w:type="dxa"/>
-              <w:start w:w="90" w:type="dxa"/>
-              <w:bottom w:w="80" w:type="dxa"/>
-              <w:end w:w="90" w:type="dxa"/>
-            </w:tcMar>
-            <w:shd w:fill="F7FBFF" w:val="clear"/>
+            <w:vAlign w:val="top"/>
+          </w:tcPr>
+          <w:p>
+            <w:r>
+              <w:t>v2.4</w:t>
+            </w:r>
+          </w:p>
+        </w:tc>
+        <w:tc>
+          <w:tcPr>
+            <w:tcMar>
+              <w:top w:w="80" w:type="dxa"/>
+              <w:start w:w="90" w:type="dxa"/>
+              <w:bottom w:w="80" w:type="dxa"/>
+              <w:end w:w="90" w:type="dxa"/>
+            </w:tcMar>
+            <w:shd w:fill="F7FBFF" w:val="clear"/>
+            <w:vAlign w:val="top"/>
           </w:tcPr>
           <w:p>
             <w:pPr>
@@ -529,6 +541,7 @@
               <w:end w:w="90" w:type="dxa"/>
             </w:tcMar>
             <w:shd w:fill="F7FBFF" w:val="clear"/>
+            <w:vAlign w:val="top"/>
           </w:tcPr>
           <w:p>
             <w:pPr>
@@ -551,7 +564,8 @@
               <w:bottom w:w="80" w:type="dxa"/>
               <w:end w:w="90" w:type="dxa"/>
             </w:tcMar>
-            <w:shd w:fill="D9EAF7" w:val="clear"/>
+            <w:shd w:val="clear" w:fill="F7FBFE"/>
+            <w:vAlign w:val="top"/>
           </w:tcPr>
           <w:p>
             <w:pPr>
@@ -571,27 +585,25 @@
               <w:bottom w:w="80" w:type="dxa"/>
               <w:end w:w="90" w:type="dxa"/>
             </w:tcMar>
-            <w:shd w:fill="D9EAF7" w:val="clear"/>
-          </w:tcPr>
-          <w:p>
-            <w:pPr>
-              <w:pStyle w:val="Compact"/>
-              <w:jc w:val="right"/>
-            </w:pPr>
-            <w:r>
-              <w:t xml:space="preserve">v2.5</w:t>
-            </w:r>
-          </w:p>
-        </w:tc>
-        <w:tc>
-          <w:tcPr>
-            <w:tcMar>
-              <w:top w:w="80" w:type="dxa"/>
-              <w:start w:w="90" w:type="dxa"/>
-              <w:bottom w:w="80" w:type="dxa"/>
-              <w:end w:w="90" w:type="dxa"/>
-            </w:tcMar>
-            <w:shd w:fill="D9EAF7" w:val="clear"/>
+            <w:shd w:val="clear" w:fill="F7FBFE"/>
+            <w:vAlign w:val="top"/>
+          </w:tcPr>
+          <w:p>
+            <w:r>
+              <w:t>v2.6</w:t>
+            </w:r>
+          </w:p>
+        </w:tc>
+        <w:tc>
+          <w:tcPr>
+            <w:tcMar>
+              <w:top w:w="80" w:type="dxa"/>
+              <w:start w:w="90" w:type="dxa"/>
+              <w:bottom w:w="80" w:type="dxa"/>
+              <w:end w:w="90" w:type="dxa"/>
+            </w:tcMar>
+            <w:shd w:val="clear" w:fill="F7FBFE"/>
+            <w:vAlign w:val="top"/>
           </w:tcPr>
           <w:p>
             <w:pPr>
@@ -611,7 +623,8 @@
               <w:bottom w:w="80" w:type="dxa"/>
               <w:end w:w="90" w:type="dxa"/>
             </w:tcMar>
-            <w:shd w:fill="D9EAF7" w:val="clear"/>
+            <w:shd w:val="clear" w:fill="F7FBFE"/>
+            <w:vAlign w:val="top"/>
           </w:tcPr>
           <w:p>
             <w:pPr>
@@ -635,6 +648,7 @@
               <w:end w:w="90" w:type="dxa"/>
             </w:tcMar>
             <w:shd w:fill="F7FBFF" w:val="clear"/>
+            <w:vAlign w:val="top"/>
           </w:tcPr>
           <w:p>
             <w:pPr>
@@ -655,26 +669,24 @@
               <w:end w:w="90" w:type="dxa"/>
             </w:tcMar>
             <w:shd w:fill="F7FBFF" w:val="clear"/>
-          </w:tcPr>
-          <w:p>
-            <w:pPr>
-              <w:pStyle w:val="Compact"/>
-              <w:jc w:val="right"/>
-            </w:pPr>
-            <w:r>
-              <w:t xml:space="preserve">v1.3</w:t>
-            </w:r>
-          </w:p>
-        </w:tc>
-        <w:tc>
-          <w:tcPr>
-            <w:tcMar>
-              <w:top w:w="80" w:type="dxa"/>
-              <w:start w:w="90" w:type="dxa"/>
-              <w:bottom w:w="80" w:type="dxa"/>
-              <w:end w:w="90" w:type="dxa"/>
-            </w:tcMar>
-            <w:shd w:fill="F7FBFF" w:val="clear"/>
+            <w:vAlign w:val="top"/>
+          </w:tcPr>
+          <w:p>
+            <w:r>
+              <w:t>v1.4</w:t>
+            </w:r>
+          </w:p>
+        </w:tc>
+        <w:tc>
+          <w:tcPr>
+            <w:tcMar>
+              <w:top w:w="80" w:type="dxa"/>
+              <w:start w:w="90" w:type="dxa"/>
+              <w:bottom w:w="80" w:type="dxa"/>
+              <w:end w:w="90" w:type="dxa"/>
+            </w:tcMar>
+            <w:shd w:fill="F7FBFF" w:val="clear"/>
+            <w:vAlign w:val="top"/>
           </w:tcPr>
           <w:p>
             <w:pPr>
@@ -695,6 +707,7 @@
               <w:end w:w="90" w:type="dxa"/>
             </w:tcMar>
             <w:shd w:fill="F7FBFF" w:val="clear"/>
+            <w:vAlign w:val="top"/>
           </w:tcPr>
           <w:p>
             <w:pPr>
@@ -717,7 +730,8 @@
               <w:bottom w:w="80" w:type="dxa"/>
               <w:end w:w="90" w:type="dxa"/>
             </w:tcMar>
-            <w:shd w:fill="D9EAF7" w:val="clear"/>
+            <w:shd w:val="clear" w:fill="F7FBFE"/>
+            <w:vAlign w:val="top"/>
           </w:tcPr>
           <w:p>
             <w:pPr>
@@ -737,27 +751,25 @@
               <w:bottom w:w="80" w:type="dxa"/>
               <w:end w:w="90" w:type="dxa"/>
             </w:tcMar>
-            <w:shd w:fill="D9EAF7" w:val="clear"/>
-          </w:tcPr>
-          <w:p>
-            <w:pPr>
-              <w:pStyle w:val="Compact"/>
-              <w:jc w:val="right"/>
-            </w:pPr>
-            <w:r>
-              <w:t xml:space="preserve">v1.5</w:t>
-            </w:r>
-          </w:p>
-        </w:tc>
-        <w:tc>
-          <w:tcPr>
-            <w:tcMar>
-              <w:top w:w="80" w:type="dxa"/>
-              <w:start w:w="90" w:type="dxa"/>
-              <w:bottom w:w="80" w:type="dxa"/>
-              <w:end w:w="90" w:type="dxa"/>
-            </w:tcMar>
-            <w:shd w:fill="D9EAF7" w:val="clear"/>
+            <w:shd w:val="clear" w:fill="F7FBFE"/>
+            <w:vAlign w:val="top"/>
+          </w:tcPr>
+          <w:p>
+            <w:r>
+              <w:t>v1.6</w:t>
+            </w:r>
+          </w:p>
+        </w:tc>
+        <w:tc>
+          <w:tcPr>
+            <w:tcMar>
+              <w:top w:w="80" w:type="dxa"/>
+              <w:start w:w="90" w:type="dxa"/>
+              <w:bottom w:w="80" w:type="dxa"/>
+              <w:end w:w="90" w:type="dxa"/>
+            </w:tcMar>
+            <w:shd w:val="clear" w:fill="F7FBFE"/>
+            <w:vAlign w:val="top"/>
           </w:tcPr>
           <w:p>
             <w:pPr>
@@ -777,7 +789,8 @@
               <w:bottom w:w="80" w:type="dxa"/>
               <w:end w:w="90" w:type="dxa"/>
             </w:tcMar>
-            <w:shd w:fill="D9EAF7" w:val="clear"/>
+            <w:shd w:val="clear" w:fill="F7FBFE"/>
+            <w:vAlign w:val="top"/>
           </w:tcPr>
           <w:p>
             <w:pPr>
@@ -801,6 +814,7 @@
               <w:end w:w="90" w:type="dxa"/>
             </w:tcMar>
             <w:shd w:fill="F7FBFF" w:val="clear"/>
+            <w:vAlign w:val="top"/>
           </w:tcPr>
           <w:p>
             <w:pPr>
@@ -821,26 +835,24 @@
               <w:end w:w="90" w:type="dxa"/>
             </w:tcMar>
             <w:shd w:fill="F7FBFF" w:val="clear"/>
-          </w:tcPr>
-          <w:p>
-            <w:pPr>
-              <w:pStyle w:val="Compact"/>
-              <w:jc w:val="right"/>
-            </w:pPr>
-            <w:r>
-              <w:t xml:space="preserve">v2.5</w:t>
-            </w:r>
-          </w:p>
-        </w:tc>
-        <w:tc>
-          <w:tcPr>
-            <w:tcMar>
-              <w:top w:w="80" w:type="dxa"/>
-              <w:start w:w="90" w:type="dxa"/>
-              <w:bottom w:w="80" w:type="dxa"/>
-              <w:end w:w="90" w:type="dxa"/>
-            </w:tcMar>
-            <w:shd w:fill="F7FBFF" w:val="clear"/>
+            <w:vAlign w:val="top"/>
+          </w:tcPr>
+          <w:p>
+            <w:r>
+              <w:t>v2.6</w:t>
+            </w:r>
+          </w:p>
+        </w:tc>
+        <w:tc>
+          <w:tcPr>
+            <w:tcMar>
+              <w:top w:w="80" w:type="dxa"/>
+              <w:start w:w="90" w:type="dxa"/>
+              <w:bottom w:w="80" w:type="dxa"/>
+              <w:end w:w="90" w:type="dxa"/>
+            </w:tcMar>
+            <w:shd w:fill="F7FBFF" w:val="clear"/>
+            <w:vAlign w:val="top"/>
           </w:tcPr>
           <w:p>
             <w:pPr>
@@ -861,6 +873,7 @@
               <w:end w:w="90" w:type="dxa"/>
             </w:tcMar>
             <w:shd w:fill="F7FBFF" w:val="clear"/>
+            <w:vAlign w:val="top"/>
           </w:tcPr>
           <w:p>
             <w:pPr>
@@ -883,7 +896,8 @@
               <w:bottom w:w="80" w:type="dxa"/>
               <w:end w:w="90" w:type="dxa"/>
             </w:tcMar>
-            <w:shd w:fill="D9EAF7" w:val="clear"/>
+            <w:shd w:val="clear" w:fill="F7FBFE"/>
+            <w:vAlign w:val="top"/>
           </w:tcPr>
           <w:p>
             <w:pPr>
@@ -903,27 +917,25 @@
               <w:bottom w:w="80" w:type="dxa"/>
               <w:end w:w="90" w:type="dxa"/>
             </w:tcMar>
-            <w:shd w:fill="D9EAF7" w:val="clear"/>
-          </w:tcPr>
-          <w:p>
-            <w:pPr>
-              <w:pStyle w:val="Compact"/>
-              <w:jc w:val="right"/>
-            </w:pPr>
-            <w:r>
-              <w:t xml:space="preserve">v0.3</w:t>
-            </w:r>
-          </w:p>
-        </w:tc>
-        <w:tc>
-          <w:tcPr>
-            <w:tcMar>
-              <w:top w:w="80" w:type="dxa"/>
-              <w:start w:w="90" w:type="dxa"/>
-              <w:bottom w:w="80" w:type="dxa"/>
-              <w:end w:w="90" w:type="dxa"/>
-            </w:tcMar>
-            <w:shd w:fill="D9EAF7" w:val="clear"/>
+            <w:shd w:val="clear" w:fill="F7FBFE"/>
+            <w:vAlign w:val="top"/>
+          </w:tcPr>
+          <w:p>
+            <w:r>
+              <w:t>v0.3</w:t>
+            </w:r>
+          </w:p>
+        </w:tc>
+        <w:tc>
+          <w:tcPr>
+            <w:tcMar>
+              <w:top w:w="80" w:type="dxa"/>
+              <w:start w:w="90" w:type="dxa"/>
+              <w:bottom w:w="80" w:type="dxa"/>
+              <w:end w:w="90" w:type="dxa"/>
+            </w:tcMar>
+            <w:shd w:val="clear" w:fill="F7FBFE"/>
+            <w:vAlign w:val="top"/>
           </w:tcPr>
           <w:p>
             <w:pPr>
@@ -943,7 +955,8 @@
               <w:bottom w:w="80" w:type="dxa"/>
               <w:end w:w="90" w:type="dxa"/>
             </w:tcMar>
-            <w:shd w:fill="D9EAF7" w:val="clear"/>
+            <w:shd w:val="clear" w:fill="F7FBFE"/>
+            <w:vAlign w:val="top"/>
           </w:tcPr>
           <w:p>
             <w:pPr>
@@ -967,6 +980,7 @@
               <w:end w:w="90" w:type="dxa"/>
             </w:tcMar>
             <w:shd w:fill="F7FBFF" w:val="clear"/>
+            <w:vAlign w:val="top"/>
           </w:tcPr>
           <w:p>
             <w:pPr>
@@ -987,26 +1001,24 @@
               <w:end w:w="90" w:type="dxa"/>
             </w:tcMar>
             <w:shd w:fill="F7FBFF" w:val="clear"/>
-          </w:tcPr>
-          <w:p>
-            <w:pPr>
-              <w:pStyle w:val="Compact"/>
-              <w:jc w:val="right"/>
-            </w:pPr>
-            <w:r>
-              <w:t xml:space="preserve">v4.3</w:t>
-            </w:r>
-          </w:p>
-        </w:tc>
-        <w:tc>
-          <w:tcPr>
-            <w:tcMar>
-              <w:top w:w="80" w:type="dxa"/>
-              <w:start w:w="90" w:type="dxa"/>
-              <w:bottom w:w="80" w:type="dxa"/>
-              <w:end w:w="90" w:type="dxa"/>
-            </w:tcMar>
-            <w:shd w:fill="F7FBFF" w:val="clear"/>
+            <w:vAlign w:val="top"/>
+          </w:tcPr>
+          <w:p>
+            <w:r>
+              <w:t>v4.4</w:t>
+            </w:r>
+          </w:p>
+        </w:tc>
+        <w:tc>
+          <w:tcPr>
+            <w:tcMar>
+              <w:top w:w="80" w:type="dxa"/>
+              <w:start w:w="90" w:type="dxa"/>
+              <w:bottom w:w="80" w:type="dxa"/>
+              <w:end w:w="90" w:type="dxa"/>
+            </w:tcMar>
+            <w:shd w:fill="F7FBFF" w:val="clear"/>
+            <w:vAlign w:val="top"/>
           </w:tcPr>
           <w:p>
             <w:pPr>
@@ -1027,6 +1039,7 @@
               <w:end w:w="90" w:type="dxa"/>
             </w:tcMar>
             <w:shd w:fill="F7FBFF" w:val="clear"/>
+            <w:vAlign w:val="top"/>
           </w:tcPr>
           <w:p>
             <w:pPr>
@@ -1049,7 +1062,8 @@
               <w:bottom w:w="80" w:type="dxa"/>
               <w:end w:w="90" w:type="dxa"/>
             </w:tcMar>
-            <w:shd w:fill="D9EAF7" w:val="clear"/>
+            <w:shd w:val="clear" w:fill="F7FBFE"/>
+            <w:vAlign w:val="top"/>
           </w:tcPr>
           <w:p>
             <w:pPr>
@@ -1069,27 +1083,25 @@
               <w:bottom w:w="80" w:type="dxa"/>
               <w:end w:w="90" w:type="dxa"/>
             </w:tcMar>
-            <w:shd w:fill="D9EAF7" w:val="clear"/>
-          </w:tcPr>
-          <w:p>
-            <w:pPr>
-              <w:pStyle w:val="Compact"/>
-              <w:jc w:val="right"/>
-            </w:pPr>
-            <w:r>
-              <w:t xml:space="preserve">v12.5</w:t>
-            </w:r>
-          </w:p>
-        </w:tc>
-        <w:tc>
-          <w:tcPr>
-            <w:tcMar>
-              <w:top w:w="80" w:type="dxa"/>
-              <w:start w:w="90" w:type="dxa"/>
-              <w:bottom w:w="80" w:type="dxa"/>
-              <w:end w:w="90" w:type="dxa"/>
-            </w:tcMar>
-            <w:shd w:fill="D9EAF7" w:val="clear"/>
+            <w:shd w:val="clear" w:fill="F7FBFE"/>
+            <w:vAlign w:val="top"/>
+          </w:tcPr>
+          <w:p>
+            <w:r>
+              <w:t>v12.6</w:t>
+            </w:r>
+          </w:p>
+        </w:tc>
+        <w:tc>
+          <w:tcPr>
+            <w:tcMar>
+              <w:top w:w="80" w:type="dxa"/>
+              <w:start w:w="90" w:type="dxa"/>
+              <w:bottom w:w="80" w:type="dxa"/>
+              <w:end w:w="90" w:type="dxa"/>
+            </w:tcMar>
+            <w:shd w:val="clear" w:fill="F7FBFE"/>
+            <w:vAlign w:val="top"/>
           </w:tcPr>
           <w:p>
             <w:pPr>
@@ -1109,7 +1121,8 @@
               <w:bottom w:w="80" w:type="dxa"/>
               <w:end w:w="90" w:type="dxa"/>
             </w:tcMar>
-            <w:shd w:fill="D9EAF7" w:val="clear"/>
+            <w:shd w:val="clear" w:fill="F7FBFE"/>
+            <w:vAlign w:val="top"/>
           </w:tcPr>
           <w:p>
             <w:pPr>
@@ -1133,6 +1146,7 @@
               <w:end w:w="90" w:type="dxa"/>
             </w:tcMar>
             <w:shd w:fill="F7FBFF" w:val="clear"/>
+            <w:vAlign w:val="top"/>
           </w:tcPr>
           <w:p>
             <w:pPr>
@@ -1153,26 +1167,24 @@
               <w:end w:w="90" w:type="dxa"/>
             </w:tcMar>
             <w:shd w:fill="F7FBFF" w:val="clear"/>
-          </w:tcPr>
-          <w:p>
-            <w:pPr>
-              <w:pStyle w:val="Compact"/>
-              <w:jc w:val="right"/>
-            </w:pPr>
-            <w:r>
-              <w:t xml:space="preserve">v2.2</w:t>
-            </w:r>
-          </w:p>
-        </w:tc>
-        <w:tc>
-          <w:tcPr>
-            <w:tcMar>
-              <w:top w:w="80" w:type="dxa"/>
-              <w:start w:w="90" w:type="dxa"/>
-              <w:bottom w:w="80" w:type="dxa"/>
-              <w:end w:w="90" w:type="dxa"/>
-            </w:tcMar>
-            <w:shd w:fill="F7FBFF" w:val="clear"/>
+            <w:vAlign w:val="top"/>
+          </w:tcPr>
+          <w:p>
+            <w:r>
+              <w:t>v2.3</w:t>
+            </w:r>
+          </w:p>
+        </w:tc>
+        <w:tc>
+          <w:tcPr>
+            <w:tcMar>
+              <w:top w:w="80" w:type="dxa"/>
+              <w:start w:w="90" w:type="dxa"/>
+              <w:bottom w:w="80" w:type="dxa"/>
+              <w:end w:w="90" w:type="dxa"/>
+            </w:tcMar>
+            <w:shd w:fill="F7FBFF" w:val="clear"/>
+            <w:vAlign w:val="top"/>
           </w:tcPr>
           <w:p>
             <w:pPr>
@@ -1193,6 +1205,7 @@
               <w:end w:w="90" w:type="dxa"/>
             </w:tcMar>
             <w:shd w:fill="F7FBFF" w:val="clear"/>
+            <w:vAlign w:val="top"/>
           </w:tcPr>
           <w:p>
             <w:pPr>
@@ -1215,7 +1228,8 @@
               <w:bottom w:w="80" w:type="dxa"/>
               <w:end w:w="90" w:type="dxa"/>
             </w:tcMar>
-            <w:shd w:fill="D9EAF7" w:val="clear"/>
+            <w:shd w:val="clear" w:fill="F7FBFE"/>
+            <w:vAlign w:val="top"/>
           </w:tcPr>
           <w:p>
             <w:pPr>
@@ -1235,27 +1249,25 @@
               <w:bottom w:w="80" w:type="dxa"/>
               <w:end w:w="90" w:type="dxa"/>
             </w:tcMar>
-            <w:shd w:fill="D9EAF7" w:val="clear"/>
-          </w:tcPr>
-          <w:p>
-            <w:pPr>
-              <w:pStyle w:val="Compact"/>
-              <w:jc w:val="right"/>
-            </w:pPr>
-            <w:r>
-              <w:t xml:space="preserve">v2.2</w:t>
-            </w:r>
-          </w:p>
-        </w:tc>
-        <w:tc>
-          <w:tcPr>
-            <w:tcMar>
-              <w:top w:w="80" w:type="dxa"/>
-              <w:start w:w="90" w:type="dxa"/>
-              <w:bottom w:w="80" w:type="dxa"/>
-              <w:end w:w="90" w:type="dxa"/>
-            </w:tcMar>
-            <w:shd w:fill="D9EAF7" w:val="clear"/>
+            <w:shd w:val="clear" w:fill="F7FBFE"/>
+            <w:vAlign w:val="top"/>
+          </w:tcPr>
+          <w:p>
+            <w:r>
+              <w:t>v2.3</w:t>
+            </w:r>
+          </w:p>
+        </w:tc>
+        <w:tc>
+          <w:tcPr>
+            <w:tcMar>
+              <w:top w:w="80" w:type="dxa"/>
+              <w:start w:w="90" w:type="dxa"/>
+              <w:bottom w:w="80" w:type="dxa"/>
+              <w:end w:w="90" w:type="dxa"/>
+            </w:tcMar>
+            <w:shd w:val="clear" w:fill="F7FBFE"/>
+            <w:vAlign w:val="top"/>
           </w:tcPr>
           <w:p>
             <w:pPr>
@@ -1275,7 +1287,8 @@
               <w:bottom w:w="80" w:type="dxa"/>
               <w:end w:w="90" w:type="dxa"/>
             </w:tcMar>
-            <w:shd w:fill="D9EAF7" w:val="clear"/>
+            <w:shd w:val="clear" w:fill="F7FBFE"/>
+            <w:vAlign w:val="top"/>
           </w:tcPr>
           <w:p>
             <w:pPr>
@@ -1299,6 +1312,7 @@
               <w:end w:w="90" w:type="dxa"/>
             </w:tcMar>
             <w:shd w:fill="F7FBFF" w:val="clear"/>
+            <w:vAlign w:val="top"/>
           </w:tcPr>
           <w:p>
             <w:pPr>
@@ -1319,26 +1333,24 @@
               <w:end w:w="90" w:type="dxa"/>
             </w:tcMar>
             <w:shd w:fill="F7FBFF" w:val="clear"/>
-          </w:tcPr>
-          <w:p>
-            <w:pPr>
-              <w:pStyle w:val="Compact"/>
-              <w:jc w:val="right"/>
-            </w:pPr>
-            <w:r>
-              <w:t xml:space="preserve">v2.2</w:t>
-            </w:r>
-          </w:p>
-        </w:tc>
-        <w:tc>
-          <w:tcPr>
-            <w:tcMar>
-              <w:top w:w="80" w:type="dxa"/>
-              <w:start w:w="90" w:type="dxa"/>
-              <w:bottom w:w="80" w:type="dxa"/>
-              <w:end w:w="90" w:type="dxa"/>
-            </w:tcMar>
-            <w:shd w:fill="F7FBFF" w:val="clear"/>
+            <w:vAlign w:val="top"/>
+          </w:tcPr>
+          <w:p>
+            <w:r>
+              <w:t>v2.3</w:t>
+            </w:r>
+          </w:p>
+        </w:tc>
+        <w:tc>
+          <w:tcPr>
+            <w:tcMar>
+              <w:top w:w="80" w:type="dxa"/>
+              <w:start w:w="90" w:type="dxa"/>
+              <w:bottom w:w="80" w:type="dxa"/>
+              <w:end w:w="90" w:type="dxa"/>
+            </w:tcMar>
+            <w:shd w:fill="F7FBFF" w:val="clear"/>
+            <w:vAlign w:val="top"/>
           </w:tcPr>
           <w:p>
             <w:pPr>
@@ -1359,6 +1371,7 @@
               <w:end w:w="90" w:type="dxa"/>
             </w:tcMar>
             <w:shd w:fill="F7FBFF" w:val="clear"/>
+            <w:vAlign w:val="top"/>
           </w:tcPr>
           <w:p>
             <w:pPr>
@@ -1381,10 +1394,11 @@
               <w:bottom w:w="80" w:type="dxa"/>
               <w:end w:w="90" w:type="dxa"/>
             </w:tcMar>
-            <w:shd w:fill="D9EAF7" w:val="clear"/>
             <w:tcBorders>
               <w:bottom w:val="single" w:sz="8" w:space="0" w:color="1F4E78"/>
             </w:tcBorders>
+            <w:shd w:val="clear" w:fill="F7FBFE"/>
+            <w:vAlign w:val="top"/>
           </w:tcPr>
           <w:p>
             <w:pPr>
@@ -1404,33 +1418,31 @@
               <w:bottom w:w="80" w:type="dxa"/>
               <w:end w:w="90" w:type="dxa"/>
             </w:tcMar>
-            <w:shd w:fill="D9EAF7" w:val="clear"/>
             <w:tcBorders>
               <w:bottom w:val="single" w:sz="8" w:space="0" w:color="1F4E78"/>
             </w:tcBorders>
-          </w:tcPr>
-          <w:p>
-            <w:pPr>
-              <w:pStyle w:val="Compact"/>
-              <w:jc w:val="right"/>
-            </w:pPr>
-            <w:r>
-              <w:t xml:space="preserve">v5.5</w:t>
-            </w:r>
-          </w:p>
-        </w:tc>
-        <w:tc>
-          <w:tcPr>
-            <w:tcMar>
-              <w:top w:w="80" w:type="dxa"/>
-              <w:start w:w="90" w:type="dxa"/>
-              <w:bottom w:w="80" w:type="dxa"/>
-              <w:end w:w="90" w:type="dxa"/>
-            </w:tcMar>
-            <w:shd w:fill="D9EAF7" w:val="clear"/>
+            <w:shd w:val="clear" w:fill="F7FBFE"/>
+            <w:vAlign w:val="top"/>
+          </w:tcPr>
+          <w:p>
+            <w:r>
+              <w:t>v5.6</w:t>
+            </w:r>
+          </w:p>
+        </w:tc>
+        <w:tc>
+          <w:tcPr>
+            <w:tcMar>
+              <w:top w:w="80" w:type="dxa"/>
+              <w:start w:w="90" w:type="dxa"/>
+              <w:bottom w:w="80" w:type="dxa"/>
+              <w:end w:w="90" w:type="dxa"/>
+            </w:tcMar>
             <w:tcBorders>
               <w:bottom w:val="single" w:sz="8" w:space="0" w:color="1F4E78"/>
             </w:tcBorders>
+            <w:shd w:val="clear" w:fill="F7FBFE"/>
+            <w:vAlign w:val="top"/>
           </w:tcPr>
           <w:p>
             <w:pPr>
@@ -1450,10 +1462,11 @@
               <w:bottom w:w="80" w:type="dxa"/>
               <w:end w:w="90" w:type="dxa"/>
             </w:tcMar>
-            <w:shd w:fill="D9EAF7" w:val="clear"/>
             <w:tcBorders>
               <w:bottom w:val="single" w:sz="8" w:space="0" w:color="1F4E78"/>
             </w:tcBorders>
+            <w:shd w:val="clear" w:fill="F7FBFE"/>
+            <w:vAlign w:val="top"/>
           </w:tcPr>
           <w:p>
             <w:pPr>
@@ -1515,7 +1528,27 @@
   <w:p>
     <w:pPr>
       <w:pStyle w:val="Footer"/>
-    </w:pPr>
+      <w:spacing w:before="0" w:after="0"/>
+      <w:jc w:val="center"/>
+    </w:pPr>
+    <w:r>
+      <w:rPr>
+        <w:rFonts w:ascii="Arial" w:hAnsi="Arial"/>
+        <w:color w:val="666666"/>
+        <w:sz w:val="16"/>
+      </w:rPr>
+      <w:t xml:space="preserve">MathGov Core Component Map v12.6 / SGP v8.5 | Page </w:t>
+    </w:r>
+    <w:fldSimple w:instr="PAGE">
+      <w:r>
+        <w:rPr>
+          <w:rFonts w:ascii="Arial" w:hAnsi="Arial" w:eastAsia="Arial"/>
+          <w:color w:val="666666"/>
+          <w:sz w:val="16"/>
+        </w:rPr>
+        <w:t>1</w:t>
+      </w:r>
+    </w:fldSimple>
   </w:p>
 </w:ftr>
 </file>

</xml_diff>